<commit_message>
Build D4 figure publication audit Word report
</commit_message>
<xml_diff>
--- a/deliverables/260812_D4_绘图组件_顶刊SCI发表水平_逐图审查_修改与新增图件建议_专家版.docx
+++ b/deliverables/260812_D4_绘图组件_顶刊SCI发表水平_逐图审查_修改与新增图件建议_专家版.docx
@@ -83,9 +83,9 @@
         <w:tblLook w:firstColumn="1" w:firstRow="1" w:lastColumn="0" w:lastRow="0" w:noHBand="0" w:noVBand="1" w:val="04A0"/>
       </w:tblPr>
       <w:tblGrid>
-        <w:gridCol w:w="3381"/>
-        <w:gridCol w:w="3381"/>
-        <w:gridCol w:w="3381"/>
+        <w:gridCol w:w="3270"/>
+        <w:gridCol w:w="3270"/>
+        <w:gridCol w:w="3270"/>
       </w:tblGrid>
       <w:tr>
         <w:tc>
@@ -650,12 +650,12 @@
         <w:tblLook w:firstColumn="1" w:firstRow="1" w:lastColumn="0" w:lastRow="0" w:noHBand="0" w:noVBand="1" w:val="04A0"/>
       </w:tblPr>
       <w:tblGrid>
-        <w:gridCol w:w="10143"/>
+        <w:gridCol w:w="9809"/>
       </w:tblGrid>
       <w:tr>
         <w:tc>
           <w:tcPr>
-            <w:tcW w:type="dxa" w:w="10143"/>
+            <w:tcW w:type="dxa" w:w="9809"/>
             <w:shd w:fill="FFF2CC"/>
             <w:tcBorders>
               <w:top w:val="single" w:sz="4" w:color="B4C6E7"/>
@@ -771,10 +771,10 @@
         <w:tblLook w:firstColumn="1" w:firstRow="1" w:lastColumn="0" w:lastRow="0" w:noHBand="0" w:noVBand="1" w:val="04A0"/>
       </w:tblPr>
       <w:tblGrid>
-        <w:gridCol w:w="2536"/>
-        <w:gridCol w:w="2536"/>
-        <w:gridCol w:w="2536"/>
-        <w:gridCol w:w="2536"/>
+        <w:gridCol w:w="2452"/>
+        <w:gridCol w:w="2452"/>
+        <w:gridCol w:w="2452"/>
+        <w:gridCol w:w="2452"/>
       </w:tblGrid>
       <w:tr>
         <w:tc>
@@ -2821,11 +2821,11 @@
         <w:tblLook w:firstColumn="1" w:firstRow="1" w:lastColumn="0" w:lastRow="0" w:noHBand="0" w:noVBand="1" w:val="04A0"/>
       </w:tblPr>
       <w:tblGrid>
-        <w:gridCol w:w="2029"/>
-        <w:gridCol w:w="2029"/>
-        <w:gridCol w:w="2029"/>
-        <w:gridCol w:w="2029"/>
-        <w:gridCol w:w="2029"/>
+        <w:gridCol w:w="1962"/>
+        <w:gridCol w:w="1962"/>
+        <w:gridCol w:w="1962"/>
+        <w:gridCol w:w="1962"/>
+        <w:gridCol w:w="1962"/>
       </w:tblGrid>
       <w:tr>
         <w:tc>
@@ -4145,10 +4145,10 @@
         <w:tblLook w:firstColumn="1" w:firstRow="1" w:lastColumn="0" w:lastRow="0" w:noHBand="0" w:noVBand="1" w:val="04A0"/>
       </w:tblPr>
       <w:tblGrid>
-        <w:gridCol w:w="2536"/>
-        <w:gridCol w:w="2536"/>
-        <w:gridCol w:w="2536"/>
-        <w:gridCol w:w="2536"/>
+        <w:gridCol w:w="2452"/>
+        <w:gridCol w:w="2452"/>
+        <w:gridCol w:w="2452"/>
+        <w:gridCol w:w="2452"/>
       </w:tblGrid>
       <w:tr>
         <w:tc>
@@ -5004,9 +5004,9 @@
         <w:tblLook w:firstColumn="1" w:firstRow="1" w:lastColumn="0" w:lastRow="0" w:noHBand="0" w:noVBand="1" w:val="04A0"/>
       </w:tblPr>
       <w:tblGrid>
-        <w:gridCol w:w="3381"/>
-        <w:gridCol w:w="3381"/>
-        <w:gridCol w:w="3381"/>
+        <w:gridCol w:w="3270"/>
+        <w:gridCol w:w="3270"/>
+        <w:gridCol w:w="3270"/>
       </w:tblGrid>
       <w:tr>
         <w:tc>
@@ -5580,10 +5580,10 @@
         <w:tblLook w:firstColumn="1" w:firstRow="1" w:lastColumn="0" w:lastRow="0" w:noHBand="0" w:noVBand="1" w:val="04A0"/>
       </w:tblPr>
       <w:tblGrid>
-        <w:gridCol w:w="2536"/>
-        <w:gridCol w:w="2536"/>
-        <w:gridCol w:w="2536"/>
-        <w:gridCol w:w="2536"/>
+        <w:gridCol w:w="2452"/>
+        <w:gridCol w:w="2452"/>
+        <w:gridCol w:w="2452"/>
+        <w:gridCol w:w="2452"/>
       </w:tblGrid>
       <w:tr>
         <w:tc>
@@ -6023,9 +6023,9 @@
         <w:tblLook w:firstColumn="1" w:firstRow="1" w:lastColumn="0" w:lastRow="0" w:noHBand="0" w:noVBand="1" w:val="04A0"/>
       </w:tblPr>
       <w:tblGrid>
-        <w:gridCol w:w="3381"/>
-        <w:gridCol w:w="3381"/>
-        <w:gridCol w:w="3381"/>
+        <w:gridCol w:w="3270"/>
+        <w:gridCol w:w="3270"/>
+        <w:gridCol w:w="3270"/>
       </w:tblGrid>
       <w:tr>
         <w:tc>
@@ -6756,9 +6756,9 @@
         <w:tblLook w:firstColumn="1" w:firstRow="1" w:lastColumn="0" w:lastRow="0" w:noHBand="0" w:noVBand="1" w:val="04A0"/>
       </w:tblPr>
       <w:tblGrid>
-        <w:gridCol w:w="3381"/>
-        <w:gridCol w:w="3381"/>
-        <w:gridCol w:w="3381"/>
+        <w:gridCol w:w="3270"/>
+        <w:gridCol w:w="3270"/>
+        <w:gridCol w:w="3270"/>
       </w:tblGrid>
       <w:tr>
         <w:tc>
@@ -7997,7 +7997,7 @@
     <w:sectPr>
       <w:headerReference w:type="default" r:id="rId17"/>
       <w:footerReference w:type="default" r:id="rId18"/>
-      <w:pgSz w:w="12240" w:h="15840"/>
+      <w:pgSz w:w="11906" w:h="16838"/>
       <w:pgMar w:top="964" w:right="1020" w:bottom="907" w:left="1077" w:header="720" w:footer="720" w:gutter="0"/>
       <w:cols w:space="720"/>
       <w:docGrid w:linePitch="360"/>

</xml_diff>